<commit_message>
Cambia la sección 01 de la guía por el rol del tallerista
La apertura describía el ciclo del taller, que la sección 02 ya narra momento
por momento. Ahora abre diciendo qué es el tallerista —operador del ejercicio y
responsable del dato— con tres reglas cortas: Mide, Devuelve, Corta.

Dos frases de la sección vieja se mudan a donde de verdad ocurren: la del caos
al momento 05 y la de la primera conclusión al 06. Sigue siendo un solo rol.

Los tres archivos quedan iguales: markdown, HTML publicado y Word.

Co-Authored-By: Claude Opus 5 <noreply@anthropic.com>
Claude-Session: https://claude.ai/code/session_01Dfvhr2eEdYrGkvRjtgqkw8
</commit_message>
<xml_diff>
--- a/docs/metodo/Guia-del-Tallerista.docx
+++ b/docs/metodo/Guia-del-Tallerista.docx
@@ -73,12 +73,12 @@
           <w:sz w:val="28"/>
           <w:szCs w:val="28"/>
         </w:rPr>
-        <w:t xml:space="preserve">Cómo funciona un taller</w:t>
-      </w:r>
-    </w:p>
-    <w:p>
-      <w:pPr>
-        <w:spacing w:after="300"/>
+        <w:t xml:space="preserve">El rol del tallerista</w:t>
+      </w:r>
+    </w:p>
+    <w:p>
+      <w:pPr>
+        <w:spacing w:after="260"/>
       </w:pPr>
       <w:r>
         <w:rPr>
@@ -87,7 +87,7 @@
           <w:sz w:val="36"/>
           <w:szCs w:val="36"/>
         </w:rPr>
-        <w:t xml:space="preserve">El taller no explica y después practica. Hace fallar, y </w:t>
+        <w:t xml:space="preserve">El tallerista no es expositor: es </w:t>
       </w:r>
       <w:r>
         <w:rPr>
@@ -96,12 +96,125 @@
           <w:sz w:val="36"/>
           <w:szCs w:val="36"/>
         </w:rPr>
-        <w:t xml:space="preserve">la teoría llega como la corrección de la falla.</w:t>
+        <w:t xml:space="preserve">operador del ejercicio y responsable del dato.</w:t>
       </w:r>
     </w:p>
     <w:p>
       <w:pPr>
         <w:spacing w:after="300"/>
+      </w:pPr>
+      <w:r>
+        <w:rPr>
+          <w:rFonts w:ascii="Calibri" w:cs="Calibri" w:eastAsia="Calibri" w:hAnsi="Calibri"/>
+          <w:color w:val="6E6A64"/>
+          <w:sz w:val="21"/>
+          <w:szCs w:val="21"/>
+        </w:rPr>
+        <w:t xml:space="preserve">El taller no explica y después practica: hace fallar, y la teoría llega como la corrección de la falla. Por eso el rol es este.</w:t>
+      </w:r>
+    </w:p>
+    <w:p>
+      <w:pPr>
+        <w:tabs>
+          <w:tab w:val="left" w:pos="1500"/>
+        </w:tabs>
+        <w:spacing w:after="190" w:line="290"/>
+        <w:ind w:left="1500" w:hanging="1500"/>
+      </w:pPr>
+      <w:r>
+        <w:rPr>
+          <w:rFonts w:ascii="Calibri" w:cs="Calibri" w:eastAsia="Calibri" w:hAnsi="Calibri"/>
+          <w:b/>
+          <w:bCs/>
+          <w:color w:val="C9431C"/>
+          <w:spacing w:val="30"/>
+          <w:sz w:val="15"/>
+          <w:szCs w:val="15"/>
+        </w:rPr>
+        <w:t xml:space="preserve">MIDE</w:t>
+      </w:r>
+      <w:r>
+        <w:tab/>
+      </w:r>
+      <w:r>
+        <w:rPr>
+          <w:rFonts w:ascii="Calibri" w:cs="Calibri" w:eastAsia="Calibri" w:hAnsi="Calibri"/>
+          <w:color w:val="6E6A64"/>
+          <w:sz w:val="21"/>
+          <w:szCs w:val="21"/>
+        </w:rPr>
+        <w:t xml:space="preserve">Si no queda un número escrito, no hubo taller.</w:t>
+      </w:r>
+    </w:p>
+    <w:p>
+      <w:pPr>
+        <w:tabs>
+          <w:tab w:val="left" w:pos="1500"/>
+        </w:tabs>
+        <w:spacing w:after="190" w:line="290"/>
+        <w:ind w:left="1500" w:hanging="1500"/>
+      </w:pPr>
+      <w:r>
+        <w:rPr>
+          <w:rFonts w:ascii="Calibri" w:cs="Calibri" w:eastAsia="Calibri" w:hAnsi="Calibri"/>
+          <w:b/>
+          <w:bCs/>
+          <w:color w:val="C9431C"/>
+          <w:spacing w:val="30"/>
+          <w:sz w:val="15"/>
+          <w:szCs w:val="15"/>
+        </w:rPr>
+        <w:t xml:space="preserve">DEVUELVE</w:t>
+      </w:r>
+      <w:r>
+        <w:tab/>
+      </w:r>
+      <w:r>
+        <w:rPr>
+          <w:rFonts w:ascii="Calibri" w:cs="Calibri" w:eastAsia="Calibri" w:hAnsi="Calibri"/>
+          <w:color w:val="6E6A64"/>
+          <w:sz w:val="21"/>
+          <w:szCs w:val="21"/>
+        </w:rPr>
+        <w:t xml:space="preserve">Ante una pregunta, responde con otra pregunta o con un dato. Nunca con la solución.</w:t>
+      </w:r>
+    </w:p>
+    <w:p>
+      <w:pPr>
+        <w:tabs>
+          <w:tab w:val="left" w:pos="1500"/>
+        </w:tabs>
+        <w:spacing w:after="190" w:line="290"/>
+        <w:ind w:left="1500" w:hanging="1500"/>
+      </w:pPr>
+      <w:r>
+        <w:rPr>
+          <w:rFonts w:ascii="Calibri" w:cs="Calibri" w:eastAsia="Calibri" w:hAnsi="Calibri"/>
+          <w:b/>
+          <w:bCs/>
+          <w:color w:val="C9431C"/>
+          <w:spacing w:val="30"/>
+          <w:sz w:val="15"/>
+          <w:szCs w:val="15"/>
+        </w:rPr>
+        <w:t xml:space="preserve">CORTA</w:t>
+      </w:r>
+      <w:r>
+        <w:tab/>
+      </w:r>
+      <w:r>
+        <w:rPr>
+          <w:rFonts w:ascii="Calibri" w:cs="Calibri" w:eastAsia="Calibri" w:hAnsi="Calibri"/>
+          <w:color w:val="6E6A64"/>
+          <w:sz w:val="21"/>
+          <w:szCs w:val="21"/>
+        </w:rPr>
+        <w:t xml:space="preserve">Sostiene el reloj aunque la conversación esté buena. El tiempo se le quita a la teoría, jamás a las corridas.</w:t>
+      </w:r>
+    </w:p>
+    <w:p>
+      <w:pPr>
+        <w:spacing w:after="0" w:before="120"/>
       </w:pPr>
       <w:r>
         <w:rPr>
@@ -109,185 +222,19 @@
           <w:b/>
           <w:bCs/>
           <w:color w:val="191817"/>
-          <w:sz w:val="21"/>
-          <w:szCs w:val="21"/>
-        </w:rPr>
-        <w:t xml:space="preserve">Instrucción incompleta</w:t>
-      </w:r>
-      <w:r>
-        <w:rPr>
-          <w:rFonts w:ascii="Calibri" w:cs="Calibri" w:eastAsia="Calibri" w:hAnsi="Calibri"/>
-          <w:color w:val="C9431C"/>
-          <w:sz w:val="21"/>
-          <w:szCs w:val="21"/>
-        </w:rPr>
-        <w:t xml:space="preserve">  →  </w:t>
-      </w:r>
-      <w:r>
-        <w:rPr>
-          <w:rFonts w:ascii="Calibri" w:cs="Calibri" w:eastAsia="Calibri" w:hAnsi="Calibri"/>
-          <w:b/>
-          <w:bCs/>
-          <w:color w:val="191817"/>
-          <w:sz w:val="21"/>
-          <w:szCs w:val="21"/>
-        </w:rPr>
-        <w:t xml:space="preserve">caos</w:t>
-      </w:r>
-      <w:r>
-        <w:rPr>
-          <w:rFonts w:ascii="Calibri" w:cs="Calibri" w:eastAsia="Calibri" w:hAnsi="Calibri"/>
-          <w:color w:val="C9431C"/>
-          <w:sz w:val="21"/>
-          <w:szCs w:val="21"/>
-        </w:rPr>
-        <w:t xml:space="preserve">  →  </w:t>
-      </w:r>
-      <w:r>
-        <w:rPr>
-          <w:rFonts w:ascii="Calibri" w:cs="Calibri" w:eastAsia="Calibri" w:hAnsi="Calibri"/>
-          <w:b/>
-          <w:bCs/>
-          <w:color w:val="191817"/>
-          <w:sz w:val="21"/>
-          <w:szCs w:val="21"/>
-        </w:rPr>
-        <w:t xml:space="preserve">corrida</w:t>
-      </w:r>
-      <w:r>
-        <w:rPr>
-          <w:rFonts w:ascii="Calibri" w:cs="Calibri" w:eastAsia="Calibri" w:hAnsi="Calibri"/>
-          <w:color w:val="C9431C"/>
-          <w:sz w:val="21"/>
-          <w:szCs w:val="21"/>
-        </w:rPr>
-        <w:t xml:space="preserve">  →  </w:t>
-      </w:r>
-      <w:r>
-        <w:rPr>
-          <w:rFonts w:ascii="Calibri" w:cs="Calibri" w:eastAsia="Calibri" w:hAnsi="Calibri"/>
-          <w:b/>
-          <w:bCs/>
-          <w:color w:val="191817"/>
-          <w:sz w:val="21"/>
-          <w:szCs w:val="21"/>
-        </w:rPr>
-        <w:t xml:space="preserve">conclusiones</w:t>
-      </w:r>
-      <w:r>
-        <w:rPr>
-          <w:rFonts w:ascii="Calibri" w:cs="Calibri" w:eastAsia="Calibri" w:hAnsi="Calibri"/>
-          <w:color w:val="C9431C"/>
-          <w:sz w:val="21"/>
-          <w:szCs w:val="21"/>
-        </w:rPr>
-        <w:t xml:space="preserve">  →  </w:t>
-      </w:r>
-      <w:r>
-        <w:rPr>
-          <w:rFonts w:ascii="Calibri" w:cs="Calibri" w:eastAsia="Calibri" w:hAnsi="Calibri"/>
-          <w:b/>
-          <w:bCs/>
-          <w:color w:val="191817"/>
-          <w:sz w:val="21"/>
-          <w:szCs w:val="21"/>
-        </w:rPr>
-        <w:t xml:space="preserve">información</w:t>
-      </w:r>
-      <w:r>
-        <w:rPr>
-          <w:rFonts w:ascii="Calibri" w:cs="Calibri" w:eastAsia="Calibri" w:hAnsi="Calibri"/>
-          <w:color w:val="C9431C"/>
-          <w:sz w:val="21"/>
-          <w:szCs w:val="21"/>
-        </w:rPr>
-        <w:t xml:space="preserve">  →  </w:t>
-      </w:r>
-      <w:r>
-        <w:rPr>
-          <w:rFonts w:ascii="Calibri" w:cs="Calibri" w:eastAsia="Calibri" w:hAnsi="Calibri"/>
-          <w:b/>
-          <w:bCs/>
-          <w:color w:val="191817"/>
-          <w:sz w:val="21"/>
-          <w:szCs w:val="21"/>
-        </w:rPr>
-        <w:t xml:space="preserve">otra corrida</w:t>
-      </w:r>
-    </w:p>
-    <w:p>
-      <w:pPr>
-        <w:spacing w:after="200"/>
-      </w:pPr>
-      <w:r>
-        <w:rPr>
-          <w:rFonts w:ascii="Calibri" w:cs="Calibri" w:eastAsia="Calibri" w:hAnsi="Calibri"/>
-          <w:b/>
-          <w:bCs/>
-          <w:color w:val="191817"/>
-          <w:sz w:val="21"/>
-          <w:szCs w:val="21"/>
-        </w:rPr>
-        <w:t xml:space="preserve">La instrucción se da por encima, a propósito.</w:t>
+          <w:sz w:val="19"/>
+          <w:szCs w:val="19"/>
+        </w:rPr>
+        <w:t xml:space="preserve">Lo que no hace:</w:t>
       </w:r>
       <w:r>
         <w:rPr>
           <w:rFonts w:ascii="Calibri" w:cs="Calibri" w:eastAsia="Calibri" w:hAnsi="Calibri"/>
           <w:color w:val="6E6A64"/>
-          <w:sz w:val="21"/>
-          <w:szCs w:val="21"/>
-        </w:rPr>
-        <w:t xml:space="preserve"> Se dice qué hay que producir, no cómo organizarse. Después se les da tiempo para planear.</w:t>
-      </w:r>
-    </w:p>
-    <w:p>
-      <w:pPr>
-        <w:spacing w:after="200"/>
-      </w:pPr>
-      <w:r>
-        <w:rPr>
-          <w:rFonts w:ascii="Calibri" w:cs="Calibri" w:eastAsia="Calibri" w:hAnsi="Calibri"/>
-          <w:b/>
-          <w:bCs/>
-          <w:color w:val="191817"/>
-          <w:sz w:val="21"/>
-          <w:szCs w:val="21"/>
-        </w:rPr>
-        <w:t xml:space="preserve">No se aclara.</w:t>
-      </w:r>
-      <w:r>
-        <w:rPr>
-          <w:rFonts w:ascii="Calibri" w:cs="Calibri" w:eastAsia="Calibri" w:hAnsi="Calibri"/>
-          <w:color w:val="6E6A64"/>
-          <w:sz w:val="21"/>
-          <w:szCs w:val="21"/>
-        </w:rPr>
-        <w:t xml:space="preserve"> Van a tener problemas de comunicación, van a pelear por quién manda y van a arrancar sin saber para dónde van. Eso es el ejercicio.</w:t>
-      </w:r>
-    </w:p>
-    <w:p>
-      <w:pPr>
-        <w:spacing w:after="200"/>
-      </w:pPr>
-      <w:r>
-        <w:rPr>
-          <w:rFonts w:ascii="Calibri" w:cs="Calibri" w:eastAsia="Calibri" w:hAnsi="Calibri"/>
-          <w:b/>
-          <w:bCs/>
-          <w:color w:val="191817"/>
-          <w:sz w:val="21"/>
-          <w:szCs w:val="21"/>
-        </w:rPr>
-        <w:t xml:space="preserve">La primera conclusión no es sobre el tema: es que no preguntaron.</w:t>
-      </w:r>
-      <w:r>
-        <w:rPr>
-          <w:rFonts w:ascii="Calibri" w:cs="Calibri" w:eastAsia="Calibri" w:hAnsi="Calibri"/>
-          <w:color w:val="6E6A64"/>
-          <w:sz w:val="21"/>
-          <w:szCs w:val="21"/>
-        </w:rPr>
-        <w:t xml:space="preserve"> Hacerla salir es trabajo suyo, y es lo que abre todo lo demás.</w:t>
+          <w:sz w:val="19"/>
+          <w:szCs w:val="19"/>
+        </w:rPr>
+        <w:t xml:space="preserve"> no arma, no corrige durante la corrida, no rescata a un equipo que va perdiendo, no adelanta conceptos, no llena silencios.</w:t>
       </w:r>
     </w:p>
     <w:p>
@@ -296,7 +243,7 @@
           <w:top w:val="single" w:color="D8D4CC" w:sz="4"/>
           <w:bottom w:val="single" w:color="D8D4CC" w:sz="4"/>
         </w:pBdr>
-        <w:spacing w:after="260" w:before="260" w:line="300"/>
+        <w:spacing w:after="260" w:before="300" w:line="300"/>
       </w:pPr>
       <w:r>
         <w:rPr>
@@ -975,7 +922,7 @@
                 <w:sz w:val="21"/>
                 <w:szCs w:val="21"/>
               </w:rPr>
-              <w:t xml:space="preserve">Diez minutos para que planeen y veinticinco de corrida cronometrada. Los tiempos van al tablero. </w:t>
+              <w:t xml:space="preserve">Diez minutos para que planeen y veinticinco de corrida cronometrada. Van a discutir quién manda y a arrancar sin saber para dónde van: eso es el ejercicio. Los tiempos van al tablero. </w:t>
             </w:r>
             <w:r>
               <w:rPr>
@@ -1083,7 +1030,27 @@
                 <w:sz w:val="21"/>
                 <w:szCs w:val="21"/>
               </w:rPr>
-              <w:t xml:space="preserve">El momento fuerte. Primero las conclusiones de lo que pasó. Después la información que corrige. Y con eso, la segunda corrida y la comparación de tiempos.</w:t>
+              <w:t xml:space="preserve">El momento fuerte. Primero las conclusiones de lo que pasó: </w:t>
+            </w:r>
+            <w:r>
+              <w:rPr>
+                <w:rFonts w:ascii="Calibri" w:cs="Calibri" w:eastAsia="Calibri" w:hAnsi="Calibri"/>
+                <w:b/>
+                <w:bCs/>
+                <w:color w:val="191817"/>
+                <w:sz w:val="21"/>
+                <w:szCs w:val="21"/>
+              </w:rPr>
+              <w:t xml:space="preserve">la primera que tiene que salir es que no preguntaron.</w:t>
+            </w:r>
+            <w:r>
+              <w:rPr>
+                <w:rFonts w:ascii="Calibri" w:cs="Calibri" w:eastAsia="Calibri" w:hAnsi="Calibri"/>
+                <w:color w:val="6E6A64"/>
+                <w:sz w:val="21"/>
+                <w:szCs w:val="21"/>
+              </w:rPr>
+              <w:t xml:space="preserve"> Después la información que corrige. Y con eso, la segunda corrida y la comparación de tiempos.</w:t>
             </w:r>
           </w:p>
         </w:tc>

</xml_diff>